<commit_message>
AL-202 add burndown chart to Dumi's Sprint 1 retrospective
</commit_message>
<xml_diff>
--- a/docs/sprint-1-submission/retrospective/Sprint-1-retrospective.docx
+++ b/docs/sprint-1-submission/retrospective/Sprint-1-retrospective.docx
@@ -2216,6 +2216,188 @@
         <w:t xml:space="preserve">Also done in Sprint 1 but not on the Jira sprint board: AL-255, extra valuation inputs (PR 92), which found the Eircode key the v2 valuation model uses.</w:t>
       </w:r>
     </w:p>
+    <w:p>
+      <w:pPr>
+        <w:pStyle w:val="Heading2"/>
+        <w:keepNext/>
+        <w:spacing w:after="60" w:before="160"/>
+      </w:pPr>
+      <w:r>
+        <w:rPr>
+          <w:rFonts w:ascii="Arial" w:cs="Arial" w:eastAsia="Arial" w:hAnsi="Arial"/>
+          <w:b/>
+          <w:bCs/>
+          <w:color w:val="1F4D3A"/>
+          <w:sz w:val="25"/>
+          <w:szCs w:val="25"/>
+        </w:rPr>
+        <w:t xml:space="preserve">Burndown chart</w:t>
+      </w:r>
+    </w:p>
+    <w:tbl>
+      <w:tblPr>
+        <w:tblW w:type="dxa" w:w="9906"/>
+        <w:tblBorders>
+          <w:top w:val="single" w:color="auto" w:sz="4"/>
+          <w:left w:val="single" w:color="auto" w:sz="4"/>
+          <w:bottom w:val="single" w:color="auto" w:sz="4"/>
+          <w:right w:val="single" w:color="auto" w:sz="4"/>
+          <w:insideH w:val="single" w:color="auto" w:sz="4"/>
+          <w:insideV w:val="single" w:color="auto" w:sz="4"/>
+        </w:tblBorders>
+      </w:tblPr>
+      <w:tblGrid>
+        <w:gridCol w:w="3000"/>
+        <w:gridCol w:w="6906"/>
+      </w:tblGrid>
+      <w:tr>
+        <w:tc>
+          <w:tcPr>
+            <w:tcW w:type="dxa" w:w="3000"/>
+            <w:tcBorders>
+              <w:top w:val="none" w:color="FFFFFF" w:sz="0"/>
+              <w:left w:val="none" w:color="FFFFFF" w:sz="0"/>
+              <w:bottom w:val="none" w:color="FFFFFF" w:sz="0"/>
+              <w:right w:val="none" w:color="FFFFFF" w:sz="0"/>
+            </w:tcBorders>
+            <w:tcMar>
+              <w:top w:type="dxa" w:w="40"/>
+              <w:left w:type="dxa" w:w="0"/>
+              <w:bottom w:type="dxa" w:w="40"/>
+              <w:right w:type="dxa" w:w="100"/>
+            </w:tcMar>
+          </w:tcPr>
+          <w:p>
+            <w:r>
+              <w:drawing>
+                <wp:inline distT="0" distB="0" distL="0" distR="0">
+                  <wp:extent cx="1428750" cy="1952625"/>
+                  <wp:effectExtent t="0" r="0" b="0" l="0"/>
+                  <wp:docPr id="1" name="burndown" descr="Jira sprint burndown for Sprint 1" title="Burndown"/>
+                  <wp:cNvGraphicFramePr>
+                    <a:graphicFrameLocks xmlns:a="http://schemas.openxmlformats.org/drawingml/2006/main" noChangeAspect="1"/>
+                  </wp:cNvGraphicFramePr>
+                  <a:graphic xmlns:a="http://schemas.openxmlformats.org/drawingml/2006/main">
+                    <a:graphicData uri="http://schemas.openxmlformats.org/drawingml/2006/picture">
+                      <pic:pic xmlns:pic="http://schemas.openxmlformats.org/drawingml/2006/picture">
+                        <pic:nvPicPr>
+                          <pic:cNvPr id="0" name="" descr=""/>
+                          <pic:cNvPicPr>
+                            <a:picLocks noChangeAspect="1" noChangeArrowheads="1"/>
+                          </pic:cNvPicPr>
+                        </pic:nvPicPr>
+                        <pic:blipFill>
+                          <a:blip r:embed="rId7" cstate="none"/>
+                          <a:srcRect/>
+                          <a:stretch>
+                            <a:fillRect/>
+                          </a:stretch>
+                        </pic:blipFill>
+                        <pic:spPr bwMode="auto">
+                          <a:xfrm>
+                            <a:off x="0" y="0"/>
+                            <a:ext cx="1428750" cy="1952625"/>
+                          </a:xfrm>
+                          <a:prstGeom prst="rect">
+                            <a:avLst/>
+                          </a:prstGeom>
+                        </pic:spPr>
+                      </pic:pic>
+                    </a:graphicData>
+                  </a:graphic>
+                </wp:inline>
+              </w:drawing>
+            </w:r>
+          </w:p>
+        </w:tc>
+        <w:tc>
+          <w:tcPr>
+            <w:tcW w:type="dxa" w:w="6906"/>
+            <w:tcBorders>
+              <w:top w:val="none" w:color="FFFFFF" w:sz="0"/>
+              <w:left w:val="none" w:color="FFFFFF" w:sz="0"/>
+              <w:bottom w:val="none" w:color="FFFFFF" w:sz="0"/>
+              <w:right w:val="none" w:color="FFFFFF" w:sz="0"/>
+            </w:tcBorders>
+            <w:tcMar>
+              <w:top w:type="dxa" w:w="40"/>
+              <w:left w:type="dxa" w:w="100"/>
+              <w:bottom w:type="dxa" w:w="40"/>
+              <w:right w:type="dxa" w:w="0"/>
+            </w:tcMar>
+          </w:tcPr>
+          <w:p>
+            <w:pPr>
+              <w:spacing w:after="100" w:line="264"/>
+            </w:pPr>
+            <w:r>
+              <w:rPr>
+                <w:rFonts w:ascii="Arial" w:cs="Arial" w:eastAsia="Arial" w:hAnsi="Arial"/>
+                <w:b/>
+                <w:bCs/>
+                <w:sz w:val="19"/>
+                <w:szCs w:val="19"/>
+              </w:rPr>
+              <w:t xml:space="preserve">Jira burndown for Sprint 1, taken 23 Oct 2026. </w:t>
+            </w:r>
+            <w:r>
+              <w:rPr>
+                <w:rFonts w:ascii="Arial" w:cs="Arial" w:eastAsia="Arial" w:hAnsi="Arial"/>
+                <w:sz w:val="19"/>
+                <w:szCs w:val="19"/>
+              </w:rPr>
+              <w:t xml:space="preserve">It ends at 44 points done and 0 to go.</w:t>
+            </w:r>
+          </w:p>
+          <w:p>
+            <w:pPr>
+              <w:spacing w:after="100" w:line="264"/>
+            </w:pPr>
+            <w:r>
+              <w:rPr>
+                <w:rFonts w:ascii="Arial" w:cs="Arial" w:eastAsia="Arial" w:hAnsi="Arial"/>
+                <w:b/>
+                <w:bCs/>
+                <w:sz w:val="19"/>
+                <w:szCs w:val="19"/>
+              </w:rPr>
+              <w:t xml:space="preserve">Why the line jumps to 400%. </w:t>
+            </w:r>
+            <w:r>
+              <w:rPr>
+                <w:rFonts w:ascii="Arial" w:cs="Arial" w:eastAsia="Arial" w:hAnsi="Arial"/>
+                <w:sz w:val="19"/>
+                <w:szCs w:val="19"/>
+              </w:rPr>
+              <w:t xml:space="preserve">No work was added during the sprint (0 points added; 8 removed, 39 modified). The jump comes from story estimates being filled in after the sprint had started: the chart began at about 13 points and rose to about 52 once the stories were pointed. The 8 removed points are a story that moved to Sprint 2. We agreed stories get points before a sprint starts, so this is a process miss.</w:t>
+            </w:r>
+          </w:p>
+          <w:p>
+            <w:pPr>
+              <w:spacing w:after="100" w:line="264"/>
+            </w:pPr>
+            <w:r>
+              <w:rPr>
+                <w:rFonts w:ascii="Arial" w:cs="Arial" w:eastAsia="Arial" w:hAnsi="Arial"/>
+                <w:b/>
+                <w:bCs/>
+                <w:sz w:val="19"/>
+                <w:szCs w:val="19"/>
+              </w:rPr>
+              <w:t xml:space="preserve">Three stories pointed late. </w:t>
+            </w:r>
+            <w:r>
+              <w:rPr>
+                <w:rFonts w:ascii="Arial" w:cs="Arial" w:eastAsia="Arial" w:hAnsi="Arial"/>
+                <w:sz w:val="19"/>
+                <w:szCs w:val="19"/>
+              </w:rPr>
+              <w:t xml:space="preserve">AL-17 (5), AL-18 (5) and AL-32 (8) had no points when the sprint ended. Nikoloz added them on 23 Oct from the estimates on his tickets and commented on each. The chart still shows 44 after that change, so it does not count them. Counting them, Sprint 1 delivered 62 points.</w:t>
+            </w:r>
+          </w:p>
+        </w:tc>
+      </w:tr>
+    </w:tbl>
     <w:p>
       <w:pPr>
         <w:pStyle w:val="Heading2"/>

</xml_diff>